<commit_message>
Revise all portfolio downloads and correct H&R premium threshold
Revise the three PRDs, two investment memos, two presentations, and two financial models for clear professional writing. Preserve requirements, financial assumptions, formulas, scenario outputs, exhibits, and download paths. Reconcile the H&R Block 20% gross IRR threshold to about 16.23% ($58.21/share), and synchronize the existing website correction note.
</commit_message>
<xml_diff>
--- a/capstack-prd.docx
+++ b/capstack-prd.docx
@@ -15,7 +15,7 @@
     </w:p>
     <w:p>
       <w:r>
-        <w:t>Cross account scenario planning for active retail investors</w:t>
+        <w:t xml:space="preserve">Compare allocation choices across investment and savings accounts</w:t>
       </w:r>
     </w:p>
     <w:p>
@@ -34,17 +34,17 @@
         <w:rPr>
           <w:color w:val="000000"/>
         </w:rPr>
-        <w:t>Product decision and opportunity</w:t>
-      </w:r>
-    </w:p>
-    <w:p>
-      <w:r>
-        <w:t>CapStack is a proposed mobile-first tool for comparing allocation decisions across existing retirement, brokerage, and savings accounts. I would focus the first release on one recurring question: how do two ways of allocating the same new contribution change a user’s goal trajectory, liquidity, and contribution capacity? The output should make assumptions visible and leave the decision with the user.</w:t>
-      </w:r>
-    </w:p>
-    <w:p>
-      <w:r>
-        <w:t>The original concept combines account aggregation, scenario modeling, contribution limits, and goals. The stronger initial product is a complete comparison loop: enter or connect accounts, verify inputs, create two alternatives, compare the consequences, and save the reasoning. A portfolio dashboard supports that loop; it is not the product’s central outcome.</w:t>
+        <w:t xml:space="preserve">Product scope</w:t>
+      </w:r>
+    </w:p>
+    <w:p>
+      <w:r>
+        <w:t xml:space="preserve">CapStack is a proposed mobile-first tool for comparing allocations across retirement, brokerage, and savings accounts. I focused the first release on how two uses of the same new contribution could change a savings goal, accessible funds, and contribution capacity. Users would review the assumptions and make their own decision.</w:t>
+      </w:r>
+    </w:p>
+    <w:p>
+      <w:r>
+        <w:t xml:space="preserve">The first release would combine account aggregation, scenario modeling, contribution limits, and goals in one comparison: enter or connect accounts, confirm inputs, define two alternatives, compare results, and save the reasoning. The dashboard supports that task.</w:t>
       </w:r>
     </w:p>
     <w:p>
@@ -55,12 +55,12 @@
         <w:rPr>
           <w:color w:val="000000"/>
         </w:rPr>
-        <w:t>Competitive research changes the thesis</w:t>
-      </w:r>
-    </w:p>
-    <w:p>
-      <w:r>
-        <w:t>Empower already supports retirement scenarios and linked accounts. Boldin offers linked accounts, tax projections, and side-by-side scenarios, with PlannerPlus listed at $144 per year. Cross-account planning therefore exists. CapStack must earn adoption through a narrower accumulation-stage use case and a faster, clearer decision experience. [C1–C3]</w:t>
+        <w:t xml:space="preserve">Existing alternatives</w:t>
+      </w:r>
+    </w:p>
+    <w:p>
+      <w:r>
+        <w:t xml:space="preserve">Empower offers retirement scenarios and linked accounts. Boldin includes linked accounts, tax projections, and side-by-side scenarios; PlannerPlus is listed at $144 per year. CapStack would need to make a recurring contribution decision easier for investors building savings. [C1–C3]</w:t>
       </w:r>
     </w:p>
     <w:tbl>
@@ -386,7 +386,7 @@
     </w:p>
     <w:p>
       <w:r>
-        <w:t>Stage: product case study and proposed PRD. Pricing, adoption, conversion, and retention figures are proposed or original research inputs where labeled; no launched user cohort is implied.</w:t>
+        <w:t xml:space="preserve">Status: product concept, not launched or validated. Pricing and product metrics below are proposed targets; the original market and behavior estimates are unvalidated inputs.</w:t>
       </w:r>
     </w:p>
     <w:p>
@@ -402,12 +402,12 @@
         <w:rPr>
           <w:color w:val="000000"/>
         </w:rPr>
-        <w:t>Discovery and decision moments</w:t>
-      </w:r>
-    </w:p>
-    <w:p>
-      <w:r>
-        <w:t>The discovery research reports 52M target investors, 3.4 accounts per investor, 67% using spreadsheets, and 76% willingness to pay. These findings motivate a cross-account planning product. The initial commercial test focuses on reachable users with an imminent decision; the broad market estimate and stated willingness to pay remain separate from observed customer acquisition and paid conversion.</w:t>
+        <w:t xml:space="preserve">Discovery and target decisions</w:t>
+      </w:r>
+    </w:p>
+    <w:p>
+      <w:r>
+        <w:t xml:space="preserve">The original concept assumes 52M target investors, 3.4 accounts per investor, 67% spreadsheet use, and 76% willingness to pay. These inputs have not been validated through customer interviews or paid conversion. I would start with reachable users facing an imminent allocation decision, then test the frequency of that need and willingness to pay.</w:t>
       </w:r>
     </w:p>
     <w:p>
@@ -423,12 +423,12 @@
     </w:p>
     <w:p>
       <w:r>
-        <w:t>Marcus, the original illustrative primary persona, is a 28-year-old software engineer with a workplace retirement plan, Roth IRA, taxable brokerage, and high-yield savings account. A bonus or compensation change creates an immediate decision. His job is to compare uses of incremental money without rebuilding a spreadsheet. The critical constraint is that payroll contributions, liquid cash, and account balances are not interchangeable.</w:t>
-      </w:r>
-    </w:p>
-    <w:p>
-      <w:r>
-        <w:t>Priya, the original goal-oriented persona, wants a down payment within four years. Her useful comparison is the accessible balance at that date, not the largest total balance across retirement and taxable accounts. A user with one passive workplace account and no active planning question remains outside the initial segment.</w:t>
+        <w:t xml:space="preserve">Marcus is an illustrative persona: a 28-year-old software engineer with a workplace retirement plan, Roth IRA, taxable brokerage, and high-yield savings account. After a bonus or pay change, he wants to compare allocations without rebuilding a spreadsheet. The model must distinguish payroll deferrals, liquid cash, and existing account balances.</w:t>
+      </w:r>
+    </w:p>
+    <w:p>
+      <w:r>
+        <w:t xml:space="preserve">Priya, the secondary illustrative persona, wants a down payment within four years. She needs to compare funds accessible at that date, rather than total retirement and taxable balances. Users with one passive workplace account and no current planning question are outside the initial segment.</w:t>
       </w:r>
     </w:p>
     <w:p>
@@ -500,7 +500,7 @@
     </w:p>
     <w:p>
       <w:r>
-        <w:t>The most important discovery question is whether the task recurs often enough to sustain a subscription. Track bonus, payroll-change, tax-year, and goal-review moments separately. Three scenario runs can represent either value or repeated confusion; the research must distinguish them.</w:t>
+        <w:t xml:space="preserve">Test how often users face a decision worth paying to model. Track bonus, payroll-change, tax-year, and goal-review occasions separately. Ask why users repeat a scenario: three runs might reflect a useful comparison or difficulty understanding the result.</w:t>
       </w:r>
     </w:p>
     <w:p>
@@ -516,7 +516,7 @@
         <w:rPr>
           <w:color w:val="000000"/>
         </w:rPr>
-        <w:t>Experience and scenario contract</w:t>
+        <w:t xml:space="preserve">Comparison workflow</w:t>
       </w:r>
     </w:p>
     <w:tbl>
@@ -1070,12 +1070,12 @@
         <w:rPr>
           <w:color w:val="000000"/>
         </w:rPr>
-        <w:t>Illustrative interaction</w:t>
-      </w:r>
-    </w:p>
-    <w:p>
-      <w:r>
-        <w:t>Marcus chooses “compare a $500 monthly contribution.” Scenario A directs it to a supported retirement account; scenario B splits it between retirement and savings. CapStack presents the total modeled balance, money accessible at the goal date, and contribution-capacity warnings under identical assumptions. It explains which differences come from return assumptions and which come from account treatment. It does not call one allocation universally optimal.</w:t>
+        <w:t xml:space="preserve">Example comparison</w:t>
+      </w:r>
+    </w:p>
+    <w:p>
+      <w:r>
+        <w:t xml:space="preserve">Marcus selects a $500 monthly contribution. Scenario A directs it to a supported retirement account; scenario B splits it between retirement and savings. Under matching assumptions, CapStack shows the total projected balance, funds accessible at the goal date, and contribution warnings. It separates the effects of return assumptions from account treatment and leaves the choice with Marcus.</w:t>
       </w:r>
     </w:p>
     <w:p>
@@ -1086,7 +1086,7 @@
         <w:rPr>
           <w:color w:val="000000"/>
         </w:rPr>
-        <w:t>Trust requirements</w:t>
+        <w:t xml:space="preserve">Clear and reliable results</w:t>
       </w:r>
     </w:p>
     <w:p>
@@ -1128,7 +1128,7 @@
         <w:t xml:space="preserve">• </w:t>
       </w:r>
       <w:r>
-        <w:t>Keep assumptions visible beside the result. A precise dollar output is not a guarantee of a precise future outcome.</w:t>
+        <w:t>Keep assumptions beside the result and label projected balances as estimates.</w:t>
       </w:r>
     </w:p>
     <w:p>
@@ -1147,7 +1147,7 @@
     </w:p>
     <w:p>
       <w:r>
-        <w:t>The first-use sequence ends in a side-by-side comparison. Moving comparison to a later phase would postpone the core value the user was promised.</w:t>
+        <w:t xml:space="preserve">The first session must end with a side-by-side comparison, so users can evaluate the product before returning.</w:t>
       </w:r>
     </w:p>
     <w:p>
@@ -1163,7 +1163,7 @@
         <w:rPr>
           <w:color w:val="000000"/>
         </w:rPr>
-        <w:t>Requirements and release priorities</w:t>
+        <w:t xml:space="preserve">Requirements and priorities</w:t>
       </w:r>
     </w:p>
     <w:p>
@@ -1174,7 +1174,7 @@
         <w:rPr>
           <w:color w:val="000000"/>
         </w:rPr>
-        <w:t>P0 Complete the comparison loop</w:t>
+        <w:t xml:space="preserve">P0 Compare two allocations</w:t>
       </w:r>
     </w:p>
     <w:p>
@@ -1390,7 +1390,7 @@
                 <w:color w:val="222222"/>
                 <w:sz w:val="18"/>
               </w:rPr>
-              <w:t>Necessary to test the core loop without waiting for all provider coverage.</w:t>
+              <w:t xml:space="preserve">Test the comparison without depending on full provider coverage.</w:t>
             </w:r>
           </w:p>
         </w:tc>
@@ -1562,7 +1562,7 @@
                 <w:color w:val="222222"/>
                 <w:sz w:val="18"/>
               </w:rPr>
-              <w:t>Add after baseline comprehension and accuracy gates.</w:t>
+              <w:t xml:space="preserve">Add after comprehension and calculation checks pass.</w:t>
             </w:r>
           </w:p>
         </w:tc>
@@ -1672,12 +1672,12 @@
         <w:rPr>
           <w:color w:val="000000"/>
         </w:rPr>
-        <w:t>Projection model and numerical validation</w:t>
-      </w:r>
-    </w:p>
-    <w:p>
-      <w:r>
-        <w:t>Use a deterministic monthly projection for the initial release. For each account, the next balance equals the current balance multiplied by one plus the monthly growth rate, plus the end-of-month contribution, less explicitly modeled withdrawals or fees. The monthly rate is derived from the selected annual effective rate. All calculations use a consistent rounding policy; display rounding must not change internal balances.</w:t>
+        <w:t xml:space="preserve">Projection model and tests</w:t>
+      </w:r>
+    </w:p>
+    <w:p>
+      <w:r>
+        <w:t xml:space="preserve">The initial model uses deterministic monthly projections. For each account, multiply the current balance by one plus the monthly growth rate, add the end-of-month contribution, and subtract modeled withdrawals or fees. Derive the monthly rate from the selected annual effective rate. Apply one rounding policy; display rounding must not alter internal balances.</w:t>
       </w:r>
     </w:p>
     <w:p>
@@ -1702,7 +1702,7 @@
         <w:t xml:space="preserve">• </w:t>
       </w:r>
       <w:r>
-        <w:t>The original 7% real-return assumption remains a selectable scenario input rather than an unlabeled expected outcome. Show sensitivity to lower returns and clearly separate nominal and real assumptions.</w:t>
+        <w:t>Keep 7% real return as a selectable scenario assumption. Show lower-return sensitivities and clearly distinguish nominal and real assumptions.</w:t>
       </w:r>
     </w:p>
     <w:p>
@@ -2129,12 +2129,12 @@
     </w:p>
     <w:p>
       <w:r>
-        <w:t>Compare boundary cases with independently calculated reference outputs before any user pilot. Test zero and negative returns, zero horizon, leap-year dates, missing values, rule-year changes, rounding, duplicate accounts, and contributions at exactly the limit. Goal dates must use accessible balances where accessibility is part of the user’s question.</w:t>
-      </w:r>
-    </w:p>
-    <w:p>
-      <w:r>
-        <w:t>Monte Carlo simulation, tax-loss harvesting, security selection, and a single opaque “tax efficiency score” are deferred. Those features would add apparent precision before the simpler model is understood and validated.</w:t>
+        <w:t xml:space="preserve">Check boundary cases against independently calculated outputs before a user pilot. Test zero and negative returns, zero horizon, leap-year dates, missing values, tax-year changes, rounding, duplicate accounts, and contributions exactly at the limit. Use accessible balances for goal dates where access matters.</w:t>
+      </w:r>
+    </w:p>
+    <w:p>
+      <w:r>
+        <w:t xml:space="preserve">Defer Monte Carlo simulation, tax-loss harvesting, security selection, and an opaque “tax efficiency score” until the simpler model is understood and validated.</w:t>
       </w:r>
     </w:p>
     <w:p>
@@ -2150,17 +2150,17 @@
         <w:rPr>
           <w:color w:val="000000"/>
         </w:rPr>
-        <w:t>Data integration and product boundaries</w:t>
-      </w:r>
-    </w:p>
-    <w:p>
-      <w:r>
-        <w:t>Proposed flow: user-authorized account data → normalized account snapshot → explicit user confirmation → versioned calculation engine → comparison and saved scenario. Keep the projection engine independent of the account-linking provider so the same model works for manual and linked inputs.</w:t>
-      </w:r>
-    </w:p>
-    <w:p>
-      <w:r>
-        <w:t>Plaid exposes holdings, investment transactions, refresh operations, and update events. These are building blocks rather than proof of complete coverage or a complete tax-year contribution ledger. Validate the data contract and freshness for each supported provider. Maintain a coverage matrix with account types, known gaps, refresh behavior, and manual correction paths. [C4]</w:t>
+        <w:t xml:space="preserve">Account data and product boundaries</w:t>
+      </w:r>
+    </w:p>
+    <w:p>
+      <w:r>
+        <w:t xml:space="preserve">Proposed flow: authorized account data → normalized snapshot → user confirmation → versioned calculation engine → comparison and saved scenario. Keep calculations independent of the linking provider so manual and connected inputs use the same model.</w:t>
+      </w:r>
+    </w:p>
+    <w:p>
+      <w:r>
+        <w:t xml:space="preserve">Plaid supplies holdings, investment transactions, refresh operations, and update events. These do not establish complete account coverage or a complete tax-year contribution history. Verify each supported provider’s data and freshness. Document account types, known gaps, refresh behavior, and manual corrections in a coverage matrix. [C4]</w:t>
       </w:r>
     </w:p>
     <w:tbl>
@@ -2561,7 +2561,7 @@
     </w:p>
     <w:p>
       <w:r>
-        <w:t>Not holding assets does not, by itself, establish that a paid product falls outside investment-adviser regulation. The SEC describes advice, compensation, and business activity as relevant elements. Product counsel should assess the actual outputs and jurisdiction before release. A disclaimer cannot substitute for that assessment. The proposed V1 comparison tool avoids trade execution and individualized security recommendations, while leaving the legal conclusion to qualified review. [C7]</w:t>
+        <w:t xml:space="preserve">The SEC’s investment-adviser definition considers advice, compensation, and business activity; avoiding custody alone does not resolve the question. Counsel must assess CapStack’s outputs and applicable jurisdictions before release. V1 excludes trade execution and individualized security recommendations, but a disclaimer cannot replace legal review. [C7]</w:t>
       </w:r>
     </w:p>
     <w:p>
@@ -2587,7 +2587,7 @@
     </w:p>
     <w:p>
       <w:r>
-        <w:t>Use completed, understood comparisons as the leading product signal. A valid comparison includes confirmed assumptions and a recorded decision takeaway. Measure task completion and comprehension together so repeated recalculation cannot inflate apparent value.</w:t>
+        <w:t xml:space="preserve">Measure completed comparisons that users understand. Require confirmed assumptions and a recorded decision takeaway, and check comprehension alongside completion. Recalculations alone do not establish value.</w:t>
       </w:r>
     </w:p>
     <w:tbl>
@@ -3036,7 +3036,7 @@
                 <w:color w:val="222222"/>
                 <w:sz w:val="18"/>
               </w:rPr>
-              <w:t>Retain &gt;40% D30 as an original target.</w:t>
+              <w:t xml:space="preserve">&gt;40% D30 retention, as proposed in the original concept.</w:t>
             </w:r>
           </w:p>
         </w:tc>
@@ -3122,7 +3122,7 @@
                 <w:color w:val="222222"/>
                 <w:sz w:val="18"/>
               </w:rPr>
-              <w:t>Test original 25% target; do not assume it in forecasts.</w:t>
+              <w:t xml:space="preserve">Test the proposed 25% conversion target before using it in forecasts.</w:t>
             </w:r>
           </w:p>
         </w:tc>
@@ -3146,7 +3146,7 @@
     </w:p>
     <w:p>
       <w:r>
-        <w:t>Run a moderated comparison with 12–15 users first. Counterbalance the order of CapStack and the existing workaround, using a participant’s permitted or simulated account situation. Measure time to a correct comparison, errors, and confidence calibration. Do not interpret this sample as a statistically powered retention experiment.</w:t>
+        <w:t xml:space="preserve">First, compare CapStack with participants’ existing methods in moderated sessions with 12–15 users. Counterbalance task order using permitted or simulated account situations. Measure time to a correct comparison, errors, and whether confidence matches understanding. This sample cannot establish retention.</w:t>
       </w:r>
     </w:p>
     <w:p>
@@ -3156,12 +3156,12 @@
     </w:p>
     <w:p>
       <w:r>
-        <w:t>The original 3+ scenarios per active user per month remains a diagnostic target. The reported 2× conversion relationship for users with three early scenarios should be tied to its original cohort evidence before use as a predictive claim. Guardrails retain &lt;8% linking errors and &lt;2% user-reported misleading projections, alongside zero known critical calculation defects. Surveys alone cannot validate financial correctness.</w:t>
-      </w:r>
-    </w:p>
-    <w:p>
-      <w:r>
-        <w:t>After the model and comprehension gates pass, compare a guided first scenario with a blank builder. Predefine activation as the primary metric and require sample-size planning before treating an A/B result as conclusive.</w:t>
+        <w:t xml:space="preserve">Use 3+ scenarios per active user per month as a diagnostic target. The original claim of 2× conversion among users running three early scenarios has no established cohort evidence and must not be treated as predictive. Keep &lt;8% linking errors, &lt;2% user-reported misleading projections, and zero known critical calculation defects as proposed limits. Calculation correctness requires testing beyond surveys.</w:t>
+      </w:r>
+    </w:p>
+    <w:p>
+      <w:r>
+        <w:t xml:space="preserve">After model tests and comprehension targets pass, compare a guided first scenario with a blank builder. Predefine activation as the primary metric and plan sample size before drawing a conclusion from the A/B test.</w:t>
       </w:r>
     </w:p>
     <w:p>
@@ -3177,7 +3177,7 @@
         <w:rPr>
           <w:color w:val="000000"/>
         </w:rPr>
-        <w:t>Positioning and subscription economics</w:t>
+        <w:t xml:space="preserve">Competition and subscription economics</w:t>
       </w:r>
     </w:p>
     <w:tbl>
@@ -3282,7 +3282,7 @@
                 <w:color w:val="FFFFFF"/>
                 <w:sz w:val="18"/>
               </w:rPr>
-              <w:t>CapStack must demonstrate</w:t>
+              <w:t xml:space="preserve">Benefit to test</w:t>
             </w:r>
           </w:p>
         </w:tc>
@@ -3368,7 +3368,7 @@
                 <w:color w:val="222222"/>
                 <w:sz w:val="18"/>
               </w:rPr>
-              <w:t>Faster accumulation-stage comparisons with a clear contribution decision as the entry point.</w:t>
+              <w:t xml:space="preserve">Quicker comparisons for investors deciding how to allocate new contributions.</w:t>
             </w:r>
           </w:p>
         </w:tc>
@@ -3454,7 +3454,7 @@
                 <w:color w:val="222222"/>
                 <w:sz w:val="18"/>
               </w:rPr>
-              <w:t>A narrower task with less setup, without assuming breadth is undesirable for all users.</w:t>
+              <w:t xml:space="preserve">Less setup for the selected task, while recognizing that some users need broader planning.</w:t>
             </w:r>
           </w:p>
         </w:tc>
@@ -3626,7 +3626,7 @@
                 <w:color w:val="222222"/>
                 <w:sz w:val="18"/>
               </w:rPr>
-              <w:t>An understandable combined comparison across the user’s existing accounts.</w:t>
+              <w:t xml:space="preserve">A clear comparison across the user’s existing accounts.</w:t>
             </w:r>
           </w:p>
         </w:tc>
@@ -3650,7 +3650,7 @@
     </w:p>
     <w:p>
       <w:r>
-        <w:t>Retain the proposed Free, $12 monthly Pro, and $99 annual Pro structure for pricing tests. Free should allow a complete first comparison; paid value can come from ongoing saved comparisons and refresh convenience. Artificially blocking the core comparison would prevent users from experiencing why they should pay.</w:t>
+        <w:t xml:space="preserve">Test Free, $12 monthly Pro, and $99 annual Pro plans. Free must include a complete first comparison. Saved history and convenient refreshes could justify paid use; users need to experience the comparison before deciding.</w:t>
       </w:r>
     </w:p>
     <w:tbl>
@@ -4112,17 +4112,17 @@
     </w:p>
     <w:p>
       <w:r>
-        <w:t>These are revenue sensitivities, not demand forecasts. The original 52M × 5% = 2.6M calculation is an adoption assumption, not a measured addressable paying segment. A reachable initial market should count target users reached through permitted communities, qualified signups, activation, and paid conversion.</w:t>
-      </w:r>
-    </w:p>
-    <w:p>
-      <w:r>
-        <w:t>At an illustrative 80% contribution margin, $12 monthly pricing yields $9.60 monthly contribution and a six-month CAC payback ceiling of $57.60. The $99 annual plan yields $6.60 monthly contribution at the same assumed margin and a $39.60 ceiling. Replace the assumptions with aggregation quotes, payment costs, support costs, and observed plan mix before buying acquisition.</w:t>
-      </w:r>
-    </w:p>
-    <w:p>
-      <w:r>
-        <w:t>The original $10K MRR target requires about 834 all-monthly subscribers. A 500-person beta converting at 25% produces 125 subscribers and $1,500 MRR. The acquisition plan must bridge that gap rather than presenting both targets as automatically consistent.</w:t>
+        <w:t xml:space="preserve">The revenue table shows plan-mix scenarios, not demand forecasts. The original 52M × 5% = 2.6M calculation assumes adoption and does not establish a paying market. Estimate the reachable market using permitted community outreach, qualified signups, activation, and conversion.</w:t>
+      </w:r>
+    </w:p>
+    <w:p>
+      <w:r>
+        <w:t xml:space="preserve">At an assumed 80% contribution margin, the $12 plan yields $9.60 monthly contribution and supports at most $57.60 CAC for six-month payback. The $99 annual plan yields $6.60 monthly contribution and a $39.60 CAC ceiling. Check aggregation quotes, payment and support costs, and actual plan mix before spending on acquisition.</w:t>
+      </w:r>
+    </w:p>
+    <w:p>
+      <w:r>
+        <w:t xml:space="preserve">The $10K MRR target requires about 834 monthly subscribers. A separate scenario with 500 beta users and 25% conversion produces 125 subscribers and $1,500 MRR. The acquisition plan must explain how to reach the larger target.</w:t>
       </w:r>
     </w:p>
     <w:p>
@@ -4138,7 +4138,7 @@
         <w:rPr>
           <w:color w:val="000000"/>
         </w:rPr>
-        <w:t>Roadmap risks and product judgment</w:t>
+        <w:t xml:space="preserve">Roadmap and risks</w:t>
       </w:r>
     </w:p>
     <w:tbl>
@@ -4216,7 +4216,7 @@
                 <w:color w:val="FFFFFF"/>
                 <w:sz w:val="18"/>
               </w:rPr>
-              <w:t>Build or learning objective</w:t>
+              <w:t xml:space="preserve">Work or research objective</w:t>
             </w:r>
           </w:p>
         </w:tc>
@@ -4692,7 +4692,7 @@
         <w:rPr>
           <w:color w:val="000000"/>
         </w:rPr>
-        <w:t>Risk response</w:t>
+        <w:t xml:space="preserve">Responses to key risks</w:t>
       </w:r>
     </w:p>
     <w:p>
@@ -4720,7 +4720,7 @@
         <w:t xml:space="preserve">• </w:t>
       </w:r>
       <w:r>
-        <w:t>Retention risk: if users return only once a year, test an annual planning product or different packaging before adding notifications to manufacture activity.</w:t>
+        <w:t>Retention risk: if users return only once a year, test annual planning or different pricing before adding reminders intended only to increase activity.</w:t>
       </w:r>
     </w:p>
     <w:p>
@@ -4748,7 +4748,7 @@
         <w:t xml:space="preserve">• </w:t>
       </w:r>
       <w:r>
-        <w:t>Competitive risk: benchmark the same task against Boldin and Empower. A generic claim of independence is insufficient differentiation.</w:t>
+        <w:t>Competitive risk: compare the same task against Boldin and Empower. Independence alone does not establish a reason to switch.</w:t>
       </w:r>
     </w:p>
     <w:p>
@@ -4759,17 +4759,17 @@
         <w:rPr>
           <w:color w:val="000000"/>
         </w:rPr>
-        <w:t>The product decisions I would defend</w:t>
-      </w:r>
-    </w:p>
-    <w:p>
-      <w:r>
-        <w:t>Comparison belongs in P0 because it is the reason to open CapStack. Manual entry belongs in P0 because it separates the usefulness of the model from the reliability of a connector. I would defer ranked recommendations and an opaque tax score until their logic and implications are reviewed. Those decisions preserve the core cross-account idea while making the first release easier to validate.</w:t>
-      </w:r>
-    </w:p>
-    <w:p>
-      <w:r>
-        <w:t>Open questions before investment: how frequently the target user faces the decision; what setup burden is acceptable; which account types have reliable contribution data; whether $12 monthly demand survives comparison with existing planners; and whether users understand the distinction between modeled balance and money available to spend. Assign each question a research owner and a release decision rather than treating it as background risk.</w:t>
+        <w:t xml:space="preserve">Why I chose this scope</w:t>
+      </w:r>
+    </w:p>
+    <w:p>
+      <w:r>
+        <w:t xml:space="preserve">I put comparison in P0 because it is the main task. Manual entry is also P0 so the model can be tested independently of connector reliability. I would defer ranked recommendations and the tax score until their calculations and legal implications are reviewed.</w:t>
+      </w:r>
+    </w:p>
+    <w:p>
+      <w:r>
+        <w:t xml:space="preserve">Before investing further, test decision frequency, acceptable setup time, reliable contribution data by account type, and demand at $12 monthly versus existing planners. Check whether users distinguish projected balances from spendable funds. Assign an owner to each question and specify how the answer changes the release decision.</w:t>
       </w:r>
     </w:p>
     <w:p>
@@ -4790,7 +4790,7 @@
     </w:p>
     <w:p>
       <w:r>
-        <w:t>External research checked in September 2026. Bracketed references identify the source supporting the adjacent claim. Product documentation establishes stated capabilities; proposed architecture, tests, targets, and business scenarios are product recommendations.</w:t>
+        <w:t xml:space="preserve">Sources checked in September 2026. Bracketed references support nearby factual claims. Architecture, tests, targets, and business scenarios are proposals.</w:t>
       </w:r>
     </w:p>
     <w:p>
@@ -4817,7 +4817,7 @@
         <w:spacing w:after="200"/>
       </w:pPr>
       <w:r>
-        <w:t>Current scenario planning proposition.</w:t>
+        <w:t xml:space="preserve">Retirement scenario planning capabilities.</w:t>
       </w:r>
     </w:p>
     <w:p>
@@ -4990,12 +4990,12 @@
         <w:rPr>
           <w:color w:val="000000"/>
         </w:rPr>
-        <w:t>Original case study research</w:t>
-      </w:r>
-    </w:p>
-    <w:p>
-      <w:r>
-        <w:t>The original one-pager and PRD remain the source for the initial personas, discovery findings, pricing hypotheses, and targets. The revision adds current external research and proposed validation. An experiment described as proposed has not been represented as completed research.</w:t>
+        <w:t xml:space="preserve">Concept research</w:t>
+      </w:r>
+    </w:p>
+    <w:p>
+      <w:r>
+        <w:t xml:space="preserve">The original case study supplied illustrative personas, unvalidated market and behavior estimates, pricing assumptions, and targets. This PRD adds vendor and regulatory references and proposed tests.</w:t>
       </w:r>
     </w:p>
     <w:sectPr>

</xml_diff>

<commit_message>
Revise all portfolio downloads and correct H&R premium threshold (#3)
Revise the three PRDs, two investment memos, two presentations, and two financial models for clear professional writing. Preserve requirements, financial assumptions, formulas, scenario outputs, exhibits, and download paths. Reconcile the H&R Block 20% gross IRR threshold to about 16.23% ($58.21/share), and synchronize the existing website correction note.
</commit_message>
<xml_diff>
--- a/capstack-prd.docx
+++ b/capstack-prd.docx
@@ -15,7 +15,7 @@
     </w:p>
     <w:p>
       <w:r>
-        <w:t>Cross account scenario planning for active retail investors</w:t>
+        <w:t xml:space="preserve">Compare allocation choices across investment and savings accounts</w:t>
       </w:r>
     </w:p>
     <w:p>
@@ -34,17 +34,17 @@
         <w:rPr>
           <w:color w:val="000000"/>
         </w:rPr>
-        <w:t>Product decision and opportunity</w:t>
-      </w:r>
-    </w:p>
-    <w:p>
-      <w:r>
-        <w:t>CapStack is a proposed mobile-first tool for comparing allocation decisions across existing retirement, brokerage, and savings accounts. I would focus the first release on one recurring question: how do two ways of allocating the same new contribution change a user’s goal trajectory, liquidity, and contribution capacity? The output should make assumptions visible and leave the decision with the user.</w:t>
-      </w:r>
-    </w:p>
-    <w:p>
-      <w:r>
-        <w:t>The original concept combines account aggregation, scenario modeling, contribution limits, and goals. The stronger initial product is a complete comparison loop: enter or connect accounts, verify inputs, create two alternatives, compare the consequences, and save the reasoning. A portfolio dashboard supports that loop; it is not the product’s central outcome.</w:t>
+        <w:t xml:space="preserve">Product scope</w:t>
+      </w:r>
+    </w:p>
+    <w:p>
+      <w:r>
+        <w:t xml:space="preserve">CapStack is a proposed mobile-first tool for comparing allocations across retirement, brokerage, and savings accounts. I focused the first release on how two uses of the same new contribution could change a savings goal, accessible funds, and contribution capacity. Users would review the assumptions and make their own decision.</w:t>
+      </w:r>
+    </w:p>
+    <w:p>
+      <w:r>
+        <w:t xml:space="preserve">The first release would combine account aggregation, scenario modeling, contribution limits, and goals in one comparison: enter or connect accounts, confirm inputs, define two alternatives, compare results, and save the reasoning. The dashboard supports that task.</w:t>
       </w:r>
     </w:p>
     <w:p>
@@ -55,12 +55,12 @@
         <w:rPr>
           <w:color w:val="000000"/>
         </w:rPr>
-        <w:t>Competitive research changes the thesis</w:t>
-      </w:r>
-    </w:p>
-    <w:p>
-      <w:r>
-        <w:t>Empower already supports retirement scenarios and linked accounts. Boldin offers linked accounts, tax projections, and side-by-side scenarios, with PlannerPlus listed at $144 per year. Cross-account planning therefore exists. CapStack must earn adoption through a narrower accumulation-stage use case and a faster, clearer decision experience. [C1–C3]</w:t>
+        <w:t xml:space="preserve">Existing alternatives</w:t>
+      </w:r>
+    </w:p>
+    <w:p>
+      <w:r>
+        <w:t xml:space="preserve">Empower offers retirement scenarios and linked accounts. Boldin includes linked accounts, tax projections, and side-by-side scenarios; PlannerPlus is listed at $144 per year. CapStack would need to make a recurring contribution decision easier for investors building savings. [C1–C3]</w:t>
       </w:r>
     </w:p>
     <w:tbl>
@@ -386,7 +386,7 @@
     </w:p>
     <w:p>
       <w:r>
-        <w:t>Stage: product case study and proposed PRD. Pricing, adoption, conversion, and retention figures are proposed or original research inputs where labeled; no launched user cohort is implied.</w:t>
+        <w:t xml:space="preserve">Status: product concept, not launched or validated. Pricing and product metrics below are proposed targets; the original market and behavior estimates are unvalidated inputs.</w:t>
       </w:r>
     </w:p>
     <w:p>
@@ -402,12 +402,12 @@
         <w:rPr>
           <w:color w:val="000000"/>
         </w:rPr>
-        <w:t>Discovery and decision moments</w:t>
-      </w:r>
-    </w:p>
-    <w:p>
-      <w:r>
-        <w:t>The discovery research reports 52M target investors, 3.4 accounts per investor, 67% using spreadsheets, and 76% willingness to pay. These findings motivate a cross-account planning product. The initial commercial test focuses on reachable users with an imminent decision; the broad market estimate and stated willingness to pay remain separate from observed customer acquisition and paid conversion.</w:t>
+        <w:t xml:space="preserve">Discovery and target decisions</w:t>
+      </w:r>
+    </w:p>
+    <w:p>
+      <w:r>
+        <w:t xml:space="preserve">The original concept assumes 52M target investors, 3.4 accounts per investor, 67% spreadsheet use, and 76% willingness to pay. These inputs have not been validated through customer interviews or paid conversion. I would start with reachable users facing an imminent allocation decision, then test the frequency of that need and willingness to pay.</w:t>
       </w:r>
     </w:p>
     <w:p>
@@ -423,12 +423,12 @@
     </w:p>
     <w:p>
       <w:r>
-        <w:t>Marcus, the original illustrative primary persona, is a 28-year-old software engineer with a workplace retirement plan, Roth IRA, taxable brokerage, and high-yield savings account. A bonus or compensation change creates an immediate decision. His job is to compare uses of incremental money without rebuilding a spreadsheet. The critical constraint is that payroll contributions, liquid cash, and account balances are not interchangeable.</w:t>
-      </w:r>
-    </w:p>
-    <w:p>
-      <w:r>
-        <w:t>Priya, the original goal-oriented persona, wants a down payment within four years. Her useful comparison is the accessible balance at that date, not the largest total balance across retirement and taxable accounts. A user with one passive workplace account and no active planning question remains outside the initial segment.</w:t>
+        <w:t xml:space="preserve">Marcus is an illustrative persona: a 28-year-old software engineer with a workplace retirement plan, Roth IRA, taxable brokerage, and high-yield savings account. After a bonus or pay change, he wants to compare allocations without rebuilding a spreadsheet. The model must distinguish payroll deferrals, liquid cash, and existing account balances.</w:t>
+      </w:r>
+    </w:p>
+    <w:p>
+      <w:r>
+        <w:t xml:space="preserve">Priya, the secondary illustrative persona, wants a down payment within four years. She needs to compare funds accessible at that date, rather than total retirement and taxable balances. Users with one passive workplace account and no current planning question are outside the initial segment.</w:t>
       </w:r>
     </w:p>
     <w:p>
@@ -500,7 +500,7 @@
     </w:p>
     <w:p>
       <w:r>
-        <w:t>The most important discovery question is whether the task recurs often enough to sustain a subscription. Track bonus, payroll-change, tax-year, and goal-review moments separately. Three scenario runs can represent either value or repeated confusion; the research must distinguish them.</w:t>
+        <w:t xml:space="preserve">Test how often users face a decision worth paying to model. Track bonus, payroll-change, tax-year, and goal-review occasions separately. Ask why users repeat a scenario: three runs might reflect a useful comparison or difficulty understanding the result.</w:t>
       </w:r>
     </w:p>
     <w:p>
@@ -516,7 +516,7 @@
         <w:rPr>
           <w:color w:val="000000"/>
         </w:rPr>
-        <w:t>Experience and scenario contract</w:t>
+        <w:t xml:space="preserve">Comparison workflow</w:t>
       </w:r>
     </w:p>
     <w:tbl>
@@ -1070,12 +1070,12 @@
         <w:rPr>
           <w:color w:val="000000"/>
         </w:rPr>
-        <w:t>Illustrative interaction</w:t>
-      </w:r>
-    </w:p>
-    <w:p>
-      <w:r>
-        <w:t>Marcus chooses “compare a $500 monthly contribution.” Scenario A directs it to a supported retirement account; scenario B splits it between retirement and savings. CapStack presents the total modeled balance, money accessible at the goal date, and contribution-capacity warnings under identical assumptions. It explains which differences come from return assumptions and which come from account treatment. It does not call one allocation universally optimal.</w:t>
+        <w:t xml:space="preserve">Example comparison</w:t>
+      </w:r>
+    </w:p>
+    <w:p>
+      <w:r>
+        <w:t xml:space="preserve">Marcus selects a $500 monthly contribution. Scenario A directs it to a supported retirement account; scenario B splits it between retirement and savings. Under matching assumptions, CapStack shows the total projected balance, funds accessible at the goal date, and contribution warnings. It separates the effects of return assumptions from account treatment and leaves the choice with Marcus.</w:t>
       </w:r>
     </w:p>
     <w:p>
@@ -1086,7 +1086,7 @@
         <w:rPr>
           <w:color w:val="000000"/>
         </w:rPr>
-        <w:t>Trust requirements</w:t>
+        <w:t xml:space="preserve">Clear and reliable results</w:t>
       </w:r>
     </w:p>
     <w:p>
@@ -1128,7 +1128,7 @@
         <w:t xml:space="preserve">• </w:t>
       </w:r>
       <w:r>
-        <w:t>Keep assumptions visible beside the result. A precise dollar output is not a guarantee of a precise future outcome.</w:t>
+        <w:t>Keep assumptions beside the result and label projected balances as estimates.</w:t>
       </w:r>
     </w:p>
     <w:p>
@@ -1147,7 +1147,7 @@
     </w:p>
     <w:p>
       <w:r>
-        <w:t>The first-use sequence ends in a side-by-side comparison. Moving comparison to a later phase would postpone the core value the user was promised.</w:t>
+        <w:t xml:space="preserve">The first session must end with a side-by-side comparison, so users can evaluate the product before returning.</w:t>
       </w:r>
     </w:p>
     <w:p>
@@ -1163,7 +1163,7 @@
         <w:rPr>
           <w:color w:val="000000"/>
         </w:rPr>
-        <w:t>Requirements and release priorities</w:t>
+        <w:t xml:space="preserve">Requirements and priorities</w:t>
       </w:r>
     </w:p>
     <w:p>
@@ -1174,7 +1174,7 @@
         <w:rPr>
           <w:color w:val="000000"/>
         </w:rPr>
-        <w:t>P0 Complete the comparison loop</w:t>
+        <w:t xml:space="preserve">P0 Compare two allocations</w:t>
       </w:r>
     </w:p>
     <w:p>
@@ -1390,7 +1390,7 @@
                 <w:color w:val="222222"/>
                 <w:sz w:val="18"/>
               </w:rPr>
-              <w:t>Necessary to test the core loop without waiting for all provider coverage.</w:t>
+              <w:t xml:space="preserve">Test the comparison without depending on full provider coverage.</w:t>
             </w:r>
           </w:p>
         </w:tc>
@@ -1562,7 +1562,7 @@
                 <w:color w:val="222222"/>
                 <w:sz w:val="18"/>
               </w:rPr>
-              <w:t>Add after baseline comprehension and accuracy gates.</w:t>
+              <w:t xml:space="preserve">Add after comprehension and calculation checks pass.</w:t>
             </w:r>
           </w:p>
         </w:tc>
@@ -1672,12 +1672,12 @@
         <w:rPr>
           <w:color w:val="000000"/>
         </w:rPr>
-        <w:t>Projection model and numerical validation</w:t>
-      </w:r>
-    </w:p>
-    <w:p>
-      <w:r>
-        <w:t>Use a deterministic monthly projection for the initial release. For each account, the next balance equals the current balance multiplied by one plus the monthly growth rate, plus the end-of-month contribution, less explicitly modeled withdrawals or fees. The monthly rate is derived from the selected annual effective rate. All calculations use a consistent rounding policy; display rounding must not change internal balances.</w:t>
+        <w:t xml:space="preserve">Projection model and tests</w:t>
+      </w:r>
+    </w:p>
+    <w:p>
+      <w:r>
+        <w:t xml:space="preserve">The initial model uses deterministic monthly projections. For each account, multiply the current balance by one plus the monthly growth rate, add the end-of-month contribution, and subtract modeled withdrawals or fees. Derive the monthly rate from the selected annual effective rate. Apply one rounding policy; display rounding must not alter internal balances.</w:t>
       </w:r>
     </w:p>
     <w:p>
@@ -1702,7 +1702,7 @@
         <w:t xml:space="preserve">• </w:t>
       </w:r>
       <w:r>
-        <w:t>The original 7% real-return assumption remains a selectable scenario input rather than an unlabeled expected outcome. Show sensitivity to lower returns and clearly separate nominal and real assumptions.</w:t>
+        <w:t>Keep 7% real return as a selectable scenario assumption. Show lower-return sensitivities and clearly distinguish nominal and real assumptions.</w:t>
       </w:r>
     </w:p>
     <w:p>
@@ -2129,12 +2129,12 @@
     </w:p>
     <w:p>
       <w:r>
-        <w:t>Compare boundary cases with independently calculated reference outputs before any user pilot. Test zero and negative returns, zero horizon, leap-year dates, missing values, rule-year changes, rounding, duplicate accounts, and contributions at exactly the limit. Goal dates must use accessible balances where accessibility is part of the user’s question.</w:t>
-      </w:r>
-    </w:p>
-    <w:p>
-      <w:r>
-        <w:t>Monte Carlo simulation, tax-loss harvesting, security selection, and a single opaque “tax efficiency score” are deferred. Those features would add apparent precision before the simpler model is understood and validated.</w:t>
+        <w:t xml:space="preserve">Check boundary cases against independently calculated outputs before a user pilot. Test zero and negative returns, zero horizon, leap-year dates, missing values, tax-year changes, rounding, duplicate accounts, and contributions exactly at the limit. Use accessible balances for goal dates where access matters.</w:t>
+      </w:r>
+    </w:p>
+    <w:p>
+      <w:r>
+        <w:t xml:space="preserve">Defer Monte Carlo simulation, tax-loss harvesting, security selection, and an opaque “tax efficiency score” until the simpler model is understood and validated.</w:t>
       </w:r>
     </w:p>
     <w:p>
@@ -2150,17 +2150,17 @@
         <w:rPr>
           <w:color w:val="000000"/>
         </w:rPr>
-        <w:t>Data integration and product boundaries</w:t>
-      </w:r>
-    </w:p>
-    <w:p>
-      <w:r>
-        <w:t>Proposed flow: user-authorized account data → normalized account snapshot → explicit user confirmation → versioned calculation engine → comparison and saved scenario. Keep the projection engine independent of the account-linking provider so the same model works for manual and linked inputs.</w:t>
-      </w:r>
-    </w:p>
-    <w:p>
-      <w:r>
-        <w:t>Plaid exposes holdings, investment transactions, refresh operations, and update events. These are building blocks rather than proof of complete coverage or a complete tax-year contribution ledger. Validate the data contract and freshness for each supported provider. Maintain a coverage matrix with account types, known gaps, refresh behavior, and manual correction paths. [C4]</w:t>
+        <w:t xml:space="preserve">Account data and product boundaries</w:t>
+      </w:r>
+    </w:p>
+    <w:p>
+      <w:r>
+        <w:t xml:space="preserve">Proposed flow: authorized account data → normalized snapshot → user confirmation → versioned calculation engine → comparison and saved scenario. Keep calculations independent of the linking provider so manual and connected inputs use the same model.</w:t>
+      </w:r>
+    </w:p>
+    <w:p>
+      <w:r>
+        <w:t xml:space="preserve">Plaid supplies holdings, investment transactions, refresh operations, and update events. These do not establish complete account coverage or a complete tax-year contribution history. Verify each supported provider’s data and freshness. Document account types, known gaps, refresh behavior, and manual corrections in a coverage matrix. [C4]</w:t>
       </w:r>
     </w:p>
     <w:tbl>
@@ -2561,7 +2561,7 @@
     </w:p>
     <w:p>
       <w:r>
-        <w:t>Not holding assets does not, by itself, establish that a paid product falls outside investment-adviser regulation. The SEC describes advice, compensation, and business activity as relevant elements. Product counsel should assess the actual outputs and jurisdiction before release. A disclaimer cannot substitute for that assessment. The proposed V1 comparison tool avoids trade execution and individualized security recommendations, while leaving the legal conclusion to qualified review. [C7]</w:t>
+        <w:t xml:space="preserve">The SEC’s investment-adviser definition considers advice, compensation, and business activity; avoiding custody alone does not resolve the question. Counsel must assess CapStack’s outputs and applicable jurisdictions before release. V1 excludes trade execution and individualized security recommendations, but a disclaimer cannot replace legal review. [C7]</w:t>
       </w:r>
     </w:p>
     <w:p>
@@ -2587,7 +2587,7 @@
     </w:p>
     <w:p>
       <w:r>
-        <w:t>Use completed, understood comparisons as the leading product signal. A valid comparison includes confirmed assumptions and a recorded decision takeaway. Measure task completion and comprehension together so repeated recalculation cannot inflate apparent value.</w:t>
+        <w:t xml:space="preserve">Measure completed comparisons that users understand. Require confirmed assumptions and a recorded decision takeaway, and check comprehension alongside completion. Recalculations alone do not establish value.</w:t>
       </w:r>
     </w:p>
     <w:tbl>
@@ -3036,7 +3036,7 @@
                 <w:color w:val="222222"/>
                 <w:sz w:val="18"/>
               </w:rPr>
-              <w:t>Retain &gt;40% D30 as an original target.</w:t>
+              <w:t xml:space="preserve">&gt;40% D30 retention, as proposed in the original concept.</w:t>
             </w:r>
           </w:p>
         </w:tc>
@@ -3122,7 +3122,7 @@
                 <w:color w:val="222222"/>
                 <w:sz w:val="18"/>
               </w:rPr>
-              <w:t>Test original 25% target; do not assume it in forecasts.</w:t>
+              <w:t xml:space="preserve">Test the proposed 25% conversion target before using it in forecasts.</w:t>
             </w:r>
           </w:p>
         </w:tc>
@@ -3146,7 +3146,7 @@
     </w:p>
     <w:p>
       <w:r>
-        <w:t>Run a moderated comparison with 12–15 users first. Counterbalance the order of CapStack and the existing workaround, using a participant’s permitted or simulated account situation. Measure time to a correct comparison, errors, and confidence calibration. Do not interpret this sample as a statistically powered retention experiment.</w:t>
+        <w:t xml:space="preserve">First, compare CapStack with participants’ existing methods in moderated sessions with 12–15 users. Counterbalance task order using permitted or simulated account situations. Measure time to a correct comparison, errors, and whether confidence matches understanding. This sample cannot establish retention.</w:t>
       </w:r>
     </w:p>
     <w:p>
@@ -3156,12 +3156,12 @@
     </w:p>
     <w:p>
       <w:r>
-        <w:t>The original 3+ scenarios per active user per month remains a diagnostic target. The reported 2× conversion relationship for users with three early scenarios should be tied to its original cohort evidence before use as a predictive claim. Guardrails retain &lt;8% linking errors and &lt;2% user-reported misleading projections, alongside zero known critical calculation defects. Surveys alone cannot validate financial correctness.</w:t>
-      </w:r>
-    </w:p>
-    <w:p>
-      <w:r>
-        <w:t>After the model and comprehension gates pass, compare a guided first scenario with a blank builder. Predefine activation as the primary metric and require sample-size planning before treating an A/B result as conclusive.</w:t>
+        <w:t xml:space="preserve">Use 3+ scenarios per active user per month as a diagnostic target. The original claim of 2× conversion among users running three early scenarios has no established cohort evidence and must not be treated as predictive. Keep &lt;8% linking errors, &lt;2% user-reported misleading projections, and zero known critical calculation defects as proposed limits. Calculation correctness requires testing beyond surveys.</w:t>
+      </w:r>
+    </w:p>
+    <w:p>
+      <w:r>
+        <w:t xml:space="preserve">After model tests and comprehension targets pass, compare a guided first scenario with a blank builder. Predefine activation as the primary metric and plan sample size before drawing a conclusion from the A/B test.</w:t>
       </w:r>
     </w:p>
     <w:p>
@@ -3177,7 +3177,7 @@
         <w:rPr>
           <w:color w:val="000000"/>
         </w:rPr>
-        <w:t>Positioning and subscription economics</w:t>
+        <w:t xml:space="preserve">Competition and subscription economics</w:t>
       </w:r>
     </w:p>
     <w:tbl>
@@ -3282,7 +3282,7 @@
                 <w:color w:val="FFFFFF"/>
                 <w:sz w:val="18"/>
               </w:rPr>
-              <w:t>CapStack must demonstrate</w:t>
+              <w:t xml:space="preserve">Benefit to test</w:t>
             </w:r>
           </w:p>
         </w:tc>
@@ -3368,7 +3368,7 @@
                 <w:color w:val="222222"/>
                 <w:sz w:val="18"/>
               </w:rPr>
-              <w:t>Faster accumulation-stage comparisons with a clear contribution decision as the entry point.</w:t>
+              <w:t xml:space="preserve">Quicker comparisons for investors deciding how to allocate new contributions.</w:t>
             </w:r>
           </w:p>
         </w:tc>
@@ -3454,7 +3454,7 @@
                 <w:color w:val="222222"/>
                 <w:sz w:val="18"/>
               </w:rPr>
-              <w:t>A narrower task with less setup, without assuming breadth is undesirable for all users.</w:t>
+              <w:t xml:space="preserve">Less setup for the selected task, while recognizing that some users need broader planning.</w:t>
             </w:r>
           </w:p>
         </w:tc>
@@ -3626,7 +3626,7 @@
                 <w:color w:val="222222"/>
                 <w:sz w:val="18"/>
               </w:rPr>
-              <w:t>An understandable combined comparison across the user’s existing accounts.</w:t>
+              <w:t xml:space="preserve">A clear comparison across the user’s existing accounts.</w:t>
             </w:r>
           </w:p>
         </w:tc>
@@ -3650,7 +3650,7 @@
     </w:p>
     <w:p>
       <w:r>
-        <w:t>Retain the proposed Free, $12 monthly Pro, and $99 annual Pro structure for pricing tests. Free should allow a complete first comparison; paid value can come from ongoing saved comparisons and refresh convenience. Artificially blocking the core comparison would prevent users from experiencing why they should pay.</w:t>
+        <w:t xml:space="preserve">Test Free, $12 monthly Pro, and $99 annual Pro plans. Free must include a complete first comparison. Saved history and convenient refreshes could justify paid use; users need to experience the comparison before deciding.</w:t>
       </w:r>
     </w:p>
     <w:tbl>
@@ -4112,17 +4112,17 @@
     </w:p>
     <w:p>
       <w:r>
-        <w:t>These are revenue sensitivities, not demand forecasts. The original 52M × 5% = 2.6M calculation is an adoption assumption, not a measured addressable paying segment. A reachable initial market should count target users reached through permitted communities, qualified signups, activation, and paid conversion.</w:t>
-      </w:r>
-    </w:p>
-    <w:p>
-      <w:r>
-        <w:t>At an illustrative 80% contribution margin, $12 monthly pricing yields $9.60 monthly contribution and a six-month CAC payback ceiling of $57.60. The $99 annual plan yields $6.60 monthly contribution at the same assumed margin and a $39.60 ceiling. Replace the assumptions with aggregation quotes, payment costs, support costs, and observed plan mix before buying acquisition.</w:t>
-      </w:r>
-    </w:p>
-    <w:p>
-      <w:r>
-        <w:t>The original $10K MRR target requires about 834 all-monthly subscribers. A 500-person beta converting at 25% produces 125 subscribers and $1,500 MRR. The acquisition plan must bridge that gap rather than presenting both targets as automatically consistent.</w:t>
+        <w:t xml:space="preserve">The revenue table shows plan-mix scenarios, not demand forecasts. The original 52M × 5% = 2.6M calculation assumes adoption and does not establish a paying market. Estimate the reachable market using permitted community outreach, qualified signups, activation, and conversion.</w:t>
+      </w:r>
+    </w:p>
+    <w:p>
+      <w:r>
+        <w:t xml:space="preserve">At an assumed 80% contribution margin, the $12 plan yields $9.60 monthly contribution and supports at most $57.60 CAC for six-month payback. The $99 annual plan yields $6.60 monthly contribution and a $39.60 CAC ceiling. Check aggregation quotes, payment and support costs, and actual plan mix before spending on acquisition.</w:t>
+      </w:r>
+    </w:p>
+    <w:p>
+      <w:r>
+        <w:t xml:space="preserve">The $10K MRR target requires about 834 monthly subscribers. A separate scenario with 500 beta users and 25% conversion produces 125 subscribers and $1,500 MRR. The acquisition plan must explain how to reach the larger target.</w:t>
       </w:r>
     </w:p>
     <w:p>
@@ -4138,7 +4138,7 @@
         <w:rPr>
           <w:color w:val="000000"/>
         </w:rPr>
-        <w:t>Roadmap risks and product judgment</w:t>
+        <w:t xml:space="preserve">Roadmap and risks</w:t>
       </w:r>
     </w:p>
     <w:tbl>
@@ -4216,7 +4216,7 @@
                 <w:color w:val="FFFFFF"/>
                 <w:sz w:val="18"/>
               </w:rPr>
-              <w:t>Build or learning objective</w:t>
+              <w:t xml:space="preserve">Work or research objective</w:t>
             </w:r>
           </w:p>
         </w:tc>
@@ -4692,7 +4692,7 @@
         <w:rPr>
           <w:color w:val="000000"/>
         </w:rPr>
-        <w:t>Risk response</w:t>
+        <w:t xml:space="preserve">Responses to key risks</w:t>
       </w:r>
     </w:p>
     <w:p>
@@ -4720,7 +4720,7 @@
         <w:t xml:space="preserve">• </w:t>
       </w:r>
       <w:r>
-        <w:t>Retention risk: if users return only once a year, test an annual planning product or different packaging before adding notifications to manufacture activity.</w:t>
+        <w:t>Retention risk: if users return only once a year, test annual planning or different pricing before adding reminders intended only to increase activity.</w:t>
       </w:r>
     </w:p>
     <w:p>
@@ -4748,7 +4748,7 @@
         <w:t xml:space="preserve">• </w:t>
       </w:r>
       <w:r>
-        <w:t>Competitive risk: benchmark the same task against Boldin and Empower. A generic claim of independence is insufficient differentiation.</w:t>
+        <w:t>Competitive risk: compare the same task against Boldin and Empower. Independence alone does not establish a reason to switch.</w:t>
       </w:r>
     </w:p>
     <w:p>
@@ -4759,17 +4759,17 @@
         <w:rPr>
           <w:color w:val="000000"/>
         </w:rPr>
-        <w:t>The product decisions I would defend</w:t>
-      </w:r>
-    </w:p>
-    <w:p>
-      <w:r>
-        <w:t>Comparison belongs in P0 because it is the reason to open CapStack. Manual entry belongs in P0 because it separates the usefulness of the model from the reliability of a connector. I would defer ranked recommendations and an opaque tax score until their logic and implications are reviewed. Those decisions preserve the core cross-account idea while making the first release easier to validate.</w:t>
-      </w:r>
-    </w:p>
-    <w:p>
-      <w:r>
-        <w:t>Open questions before investment: how frequently the target user faces the decision; what setup burden is acceptable; which account types have reliable contribution data; whether $12 monthly demand survives comparison with existing planners; and whether users understand the distinction between modeled balance and money available to spend. Assign each question a research owner and a release decision rather than treating it as background risk.</w:t>
+        <w:t xml:space="preserve">Why I chose this scope</w:t>
+      </w:r>
+    </w:p>
+    <w:p>
+      <w:r>
+        <w:t xml:space="preserve">I put comparison in P0 because it is the main task. Manual entry is also P0 so the model can be tested independently of connector reliability. I would defer ranked recommendations and the tax score until their calculations and legal implications are reviewed.</w:t>
+      </w:r>
+    </w:p>
+    <w:p>
+      <w:r>
+        <w:t xml:space="preserve">Before investing further, test decision frequency, acceptable setup time, reliable contribution data by account type, and demand at $12 monthly versus existing planners. Check whether users distinguish projected balances from spendable funds. Assign an owner to each question and specify how the answer changes the release decision.</w:t>
       </w:r>
     </w:p>
     <w:p>
@@ -4790,7 +4790,7 @@
     </w:p>
     <w:p>
       <w:r>
-        <w:t>External research checked in September 2026. Bracketed references identify the source supporting the adjacent claim. Product documentation establishes stated capabilities; proposed architecture, tests, targets, and business scenarios are product recommendations.</w:t>
+        <w:t xml:space="preserve">Sources checked in September 2026. Bracketed references support nearby factual claims. Architecture, tests, targets, and business scenarios are proposals.</w:t>
       </w:r>
     </w:p>
     <w:p>
@@ -4817,7 +4817,7 @@
         <w:spacing w:after="200"/>
       </w:pPr>
       <w:r>
-        <w:t>Current scenario planning proposition.</w:t>
+        <w:t xml:space="preserve">Retirement scenario planning capabilities.</w:t>
       </w:r>
     </w:p>
     <w:p>
@@ -4990,12 +4990,12 @@
         <w:rPr>
           <w:color w:val="000000"/>
         </w:rPr>
-        <w:t>Original case study research</w:t>
-      </w:r>
-    </w:p>
-    <w:p>
-      <w:r>
-        <w:t>The original one-pager and PRD remain the source for the initial personas, discovery findings, pricing hypotheses, and targets. The revision adds current external research and proposed validation. An experiment described as proposed has not been represented as completed research.</w:t>
+        <w:t xml:space="preserve">Concept research</w:t>
+      </w:r>
+    </w:p>
+    <w:p>
+      <w:r>
+        <w:t xml:space="preserve">The original case study supplied illustrative personas, unvalidated market and behavior estimates, pricing assumptions, and targets. This PRD adds vendor and regulatory references and proposed tests.</w:t>
       </w:r>
     </w:p>
     <w:sectPr>

</xml_diff>